<commit_message>
feat: update visit recommendation export to use final assessment values and clean up UI components
</commit_message>
<xml_diff>
--- a/public/template_hasil_visitasi.docx
+++ b/public/template_hasil_visitasi.docx
@@ -1,6 +1,6 @@
 
 <file path=word/document.xml><?xml version="1.0" encoding="utf-8"?>
-<w:document xmlns:wpc="http://schemas.microsoft.com/office/word/2010/wordprocessingCanvas" xmlns:cx="http://schemas.microsoft.com/office/drawing/2014/chartex" xmlns:cx1="http://schemas.microsoft.com/office/drawing/2015/9/8/chartex" xmlns:cx2="http://schemas.microsoft.com/office/drawing/2015/10/21/chartex" xmlns:cx3="http://schemas.microsoft.com/office/drawing/2016/5/9/chartex" xmlns:cx4="http://schemas.microsoft.com/office/drawing/2016/5/10/chartex" xmlns:cx5="http://schemas.microsoft.com/office/drawing/2016/5/11/chartex" xmlns:cx6="http://schemas.microsoft.com/office/drawing/2016/5/12/chartex" xmlns:cx7="http://schemas.microsoft.com/office/drawing/2016/5/13/chartex" xmlns:cx8="http://schemas.microsoft.com/office/drawing/2016/5/14/chartex" xmlns:mc="http://schemas.openxmlformats.org/markup-compatibility/2006" xmlns:aink="http://schemas.microsoft.com/office/drawing/2016/ink" xmlns:am3d="http://schemas.microsoft.com/office/drawing/2017/model3d" xmlns:o="urn:schemas-microsoft-com:office:office" xmlns:oel="http://schemas.microsoft.com/office/2019/extlst" xmlns:r="http://schemas.openxmlformats.org/officeDocument/2006/relationships" xmlns:m="http://schemas.openxmlformats.org/officeDocument/2006/math" xmlns:v="urn:schemas-microsoft-com:vml" xmlns:wp14="http://schemas.microsoft.com/office/word/2010/wordprocessingDrawing" xmlns:wp="http://schemas.openxmlformats.org/drawingml/2006/wordprocessingDrawing" xmlns:w10="urn:schemas-microsoft-com:office:word" xmlns:w="http://schemas.openxmlformats.org/wordprocessingml/2006/main" xmlns:w14="http://schemas.microsoft.com/office/word/2010/wordml" xmlns:w15="http://schemas.microsoft.com/office/word/2012/wordml" xmlns:w16cex="http://schemas.microsoft.com/office/word/2018/wordml/cex" xmlns:w16cid="http://schemas.microsoft.com/office/word/2016/wordml/cid" xmlns:w16="http://schemas.microsoft.com/office/word/2018/wordml" xmlns:w16du="http://schemas.microsoft.com/office/word/2023/wordml/word16du" xmlns:w16sdtdh="http://schemas.microsoft.com/office/word/2020/wordml/sdtdatahash" xmlns:w16sdtfl="http://schemas.microsoft.com/office/word/2024/wordml/sdtformatlock" xmlns:w16se="http://schemas.microsoft.com/office/word/2015/wordml/symex" xmlns:wpg="http://schemas.microsoft.com/office/word/2010/wordprocessingGroup" xmlns:wpi="http://schemas.microsoft.com/office/word/2010/wordprocessingInk" xmlns:wne="http://schemas.microsoft.com/office/word/2006/wordml" xmlns:wps="http://schemas.microsoft.com/office/word/2010/wordprocessingShape" mc:Ignorable="w14 w15 w16se w16cid w16 w16cex w16sdtdh w16sdtfl w16du wp14">
+<w:document xmlns:wpc="http://schemas.microsoft.com/office/word/2010/wordprocessingCanvas" xmlns:cx="http://schemas.microsoft.com/office/drawing/2014/chartex" xmlns:cx1="http://schemas.microsoft.com/office/drawing/2015/9/8/chartex" xmlns:cx2="http://schemas.microsoft.com/office/drawing/2015/10/21/chartex" xmlns:cx3="http://schemas.microsoft.com/office/drawing/2016/5/9/chartex" xmlns:cx4="http://schemas.microsoft.com/office/drawing/2016/5/10/chartex" xmlns:cx5="http://schemas.microsoft.com/office/drawing/2016/5/11/chartex" xmlns:cx6="http://schemas.microsoft.com/office/drawing/2016/5/12/chartex" xmlns:cx7="http://schemas.microsoft.com/office/drawing/2016/5/13/chartex" xmlns:cx8="http://schemas.microsoft.com/office/drawing/2016/5/14/chartex" xmlns:mc="http://schemas.openxmlformats.org/markup-compatibility/2006" xmlns:m="http://schemas.openxmlformats.org/officeDocument/2006/math" xmlns:aink="http://schemas.microsoft.com/office/drawing/2016/ink" xmlns:am3d="http://schemas.microsoft.com/office/drawing/2017/model3d" xmlns:oel="http://schemas.microsoft.com/office/2019/extlst" xmlns:r="http://schemas.openxmlformats.org/officeDocument/2006/relationships" xmlns:wp14="http://schemas.microsoft.com/office/word/2010/wordprocessingDrawing" xmlns:wp="http://schemas.openxmlformats.org/drawingml/2006/wordprocessingDrawing" xmlns:wpg="http://schemas.microsoft.com/office/word/2010/wordprocessingGroup" xmlns:wpi="http://schemas.microsoft.com/office/word/2010/wordprocessingInk" xmlns:wps="http://schemas.microsoft.com/office/word/2010/wordprocessingShape" xmlns:o="urn:schemas-microsoft-com:office:office" xmlns:v="urn:schemas-microsoft-com:vml" xmlns:w10="urn:schemas-microsoft-com:office:word" xmlns:w="http://schemas.openxmlformats.org/wordprocessingml/2006/main" xmlns:w14="http://schemas.microsoft.com/office/word/2010/wordml" xmlns:w15="http://schemas.microsoft.com/office/word/2012/wordml" xmlns:w16cex="http://schemas.microsoft.com/office/word/2018/wordml/cex" xmlns:w16cid="http://schemas.microsoft.com/office/word/2016/wordml/cid" xmlns:w16="http://schemas.microsoft.com/office/word/2018/wordml" xmlns:w16sdtdh="http://schemas.microsoft.com/office/word/2020/wordml/sdtdatahash" xmlns:w16sdtfl="http://schemas.microsoft.com/office/word/2024/wordml/sdtformatlock" xmlns:w16se="http://schemas.microsoft.com/office/word/2015/wordml/symex" xmlns:w16du="http://schemas.microsoft.com/office/word/2023/wordml/word16du" xmlns:wne="http://schemas.microsoft.com/office/word/2006/wordml" mc:Ignorable="w14 w15 w16se w16cid w16 w16cex w16sdtdh w16sdtfl w16du wp14">
   <w:body>
     <w:p>
       <w:pPr>
@@ -451,7 +451,7 @@
                 <w:sz w:val="22"/>
                 <w:szCs w:val="22"/>
               </w:rPr>
-              <w:t>pravisit2</w:t>
+              <w:t>final</w:t>
             </w:r>
             <w:r>
               <w:rPr>
@@ -486,7 +486,16 @@
                 <w:sz w:val="22"/>
                 <w:szCs w:val="22"/>
               </w:rPr>
-              <w:t>_pravisit2</w:t>
+              <w:t>_</w:t>
+            </w:r>
+            <w:r>
+              <w:rPr>
+                <w:rFonts w:ascii="Bookman Old Style" w:eastAsia="Bookman Old Style" w:hAnsi="Bookman Old Style" w:cs="Bookman Old Style"/>
+                <w:color w:val="FF0000"/>
+                <w:sz w:val="22"/>
+                <w:szCs w:val="22"/>
+              </w:rPr>
+              <w:t>final</w:t>
             </w:r>
             <w:r>
               <w:rPr>
@@ -889,7 +898,7 @@
               <w:ind w:left="624" w:hanging="624"/>
               <w:rPr>
                 <w:rFonts w:ascii="Bookman Old Style" w:eastAsia="Bookman Old Style" w:hAnsi="Bookman Old Style" w:cs="Bookman Old Style"/>
-                <w:b/>
+                <w:bCs/>
                 <w:sz w:val="22"/>
                 <w:szCs w:val="22"/>
               </w:rPr>
@@ -897,7 +906,7 @@
             <w:r>
               <w:rPr>
                 <w:rFonts w:ascii="Bookman Old Style" w:eastAsia="Bookman Old Style" w:hAnsi="Bookman Old Style" w:cs="Bookman Old Style"/>
-                <w:b/>
+                <w:bCs/>
                 <w:sz w:val="22"/>
                 <w:szCs w:val="22"/>
               </w:rPr>
@@ -906,7 +915,7 @@
             <w:r>
               <w:rPr>
                 <w:rFonts w:ascii="Bookman Old Style" w:eastAsia="Bookman Old Style" w:hAnsi="Bookman Old Style" w:cs="Bookman Old Style"/>
-                <w:b/>
+                <w:bCs/>
                 <w:sz w:val="22"/>
                 <w:szCs w:val="22"/>
               </w:rPr>
@@ -1048,7 +1057,7 @@
 </file>
 
 <file path=word/numbering.xml><?xml version="1.0" encoding="utf-8"?>
-<w:numbering xmlns:wpc="http://schemas.microsoft.com/office/word/2010/wordprocessingCanvas" xmlns:cx="http://schemas.microsoft.com/office/drawing/2014/chartex" xmlns:cx1="http://schemas.microsoft.com/office/drawing/2015/9/8/chartex" xmlns:cx2="http://schemas.microsoft.com/office/drawing/2015/10/21/chartex" xmlns:cx3="http://schemas.microsoft.com/office/drawing/2016/5/9/chartex" xmlns:cx4="http://schemas.microsoft.com/office/drawing/2016/5/10/chartex" xmlns:cx5="http://schemas.microsoft.com/office/drawing/2016/5/11/chartex" xmlns:cx6="http://schemas.microsoft.com/office/drawing/2016/5/12/chartex" xmlns:cx7="http://schemas.microsoft.com/office/drawing/2016/5/13/chartex" xmlns:cx8="http://schemas.microsoft.com/office/drawing/2016/5/14/chartex" xmlns:mc="http://schemas.openxmlformats.org/markup-compatibility/2006" xmlns:aink="http://schemas.microsoft.com/office/drawing/2016/ink" xmlns:am3d="http://schemas.microsoft.com/office/drawing/2017/model3d" xmlns:o="urn:schemas-microsoft-com:office:office" xmlns:oel="http://schemas.microsoft.com/office/2019/extlst" xmlns:r="http://schemas.openxmlformats.org/officeDocument/2006/relationships" xmlns:m="http://schemas.openxmlformats.org/officeDocument/2006/math" xmlns:v="urn:schemas-microsoft-com:vml" xmlns:wp14="http://schemas.microsoft.com/office/word/2010/wordprocessingDrawing" xmlns:wp="http://schemas.openxmlformats.org/drawingml/2006/wordprocessingDrawing" xmlns:w10="urn:schemas-microsoft-com:office:word" xmlns:w="http://schemas.openxmlformats.org/wordprocessingml/2006/main" xmlns:w14="http://schemas.microsoft.com/office/word/2010/wordml" xmlns:w15="http://schemas.microsoft.com/office/word/2012/wordml" xmlns:w16cex="http://schemas.microsoft.com/office/word/2018/wordml/cex" xmlns:w16cid="http://schemas.microsoft.com/office/word/2016/wordml/cid" xmlns:w16="http://schemas.microsoft.com/office/word/2018/wordml" xmlns:w16du="http://schemas.microsoft.com/office/word/2023/wordml/word16du" xmlns:w16sdtdh="http://schemas.microsoft.com/office/word/2020/wordml/sdtdatahash" xmlns:w16sdtfl="http://schemas.microsoft.com/office/word/2024/wordml/sdtformatlock" xmlns:w16se="http://schemas.microsoft.com/office/word/2015/wordml/symex" xmlns:wpg="http://schemas.microsoft.com/office/word/2010/wordprocessingGroup" xmlns:wpi="http://schemas.microsoft.com/office/word/2010/wordprocessingInk" xmlns:wne="http://schemas.microsoft.com/office/word/2006/wordml" xmlns:wps="http://schemas.microsoft.com/office/word/2010/wordprocessingShape" mc:Ignorable="w14 w15 w16se w16cid w16 w16cex w16sdtdh w16sdtfl w16du wp14">
+<w:numbering xmlns:wpc="http://schemas.microsoft.com/office/word/2010/wordprocessingCanvas" xmlns:cx="http://schemas.microsoft.com/office/drawing/2014/chartex" xmlns:cx1="http://schemas.microsoft.com/office/drawing/2015/9/8/chartex" xmlns:cx2="http://schemas.microsoft.com/office/drawing/2015/10/21/chartex" xmlns:cx3="http://schemas.microsoft.com/office/drawing/2016/5/9/chartex" xmlns:cx4="http://schemas.microsoft.com/office/drawing/2016/5/10/chartex" xmlns:cx5="http://schemas.microsoft.com/office/drawing/2016/5/11/chartex" xmlns:cx6="http://schemas.microsoft.com/office/drawing/2016/5/12/chartex" xmlns:cx7="http://schemas.microsoft.com/office/drawing/2016/5/13/chartex" xmlns:cx8="http://schemas.microsoft.com/office/drawing/2016/5/14/chartex" xmlns:mc="http://schemas.openxmlformats.org/markup-compatibility/2006" xmlns:m="http://schemas.openxmlformats.org/officeDocument/2006/math" xmlns:aink="http://schemas.microsoft.com/office/drawing/2016/ink" xmlns:am3d="http://schemas.microsoft.com/office/drawing/2017/model3d" xmlns:oel="http://schemas.microsoft.com/office/2019/extlst" xmlns:r="http://schemas.openxmlformats.org/officeDocument/2006/relationships" xmlns:wp14="http://schemas.microsoft.com/office/word/2010/wordprocessingDrawing" xmlns:wp="http://schemas.openxmlformats.org/drawingml/2006/wordprocessingDrawing" xmlns:wpg="http://schemas.microsoft.com/office/word/2010/wordprocessingGroup" xmlns:wpi="http://schemas.microsoft.com/office/word/2010/wordprocessingInk" xmlns:wps="http://schemas.microsoft.com/office/word/2010/wordprocessingShape" xmlns:o="urn:schemas-microsoft-com:office:office" xmlns:v="urn:schemas-microsoft-com:vml" xmlns:w10="urn:schemas-microsoft-com:office:word" xmlns:w="http://schemas.openxmlformats.org/wordprocessingml/2006/main" xmlns:w14="http://schemas.microsoft.com/office/word/2010/wordml" xmlns:w15="http://schemas.microsoft.com/office/word/2012/wordml" xmlns:w16cex="http://schemas.microsoft.com/office/word/2018/wordml/cex" xmlns:w16cid="http://schemas.microsoft.com/office/word/2016/wordml/cid" xmlns:w16="http://schemas.microsoft.com/office/word/2018/wordml" xmlns:w16sdtdh="http://schemas.microsoft.com/office/word/2020/wordml/sdtdatahash" xmlns:w16sdtfl="http://schemas.microsoft.com/office/word/2024/wordml/sdtformatlock" xmlns:w16se="http://schemas.microsoft.com/office/word/2015/wordml/symex" xmlns:w16du="http://schemas.microsoft.com/office/word/2023/wordml/word16du" xmlns:wne="http://schemas.microsoft.com/office/word/2006/wordml" mc:Ignorable="w14 w15 w16se w16cid w16 w16cex w16sdtdh w16sdtfl w16du wp14">
   <w:abstractNum w:abstractNumId="0" w15:restartNumberingAfterBreak="0">
     <w:nsid w:val="1AE864EE"/>
     <w:multiLevelType w:val="multilevel"/>
@@ -1555,7 +1564,7 @@
 </file>
 
 <file path=word/styles.xml><?xml version="1.0" encoding="utf-8"?>
-<w:styles xmlns:mc="http://schemas.openxmlformats.org/markup-compatibility/2006" xmlns:r="http://schemas.openxmlformats.org/officeDocument/2006/relationships" xmlns:w="http://schemas.openxmlformats.org/wordprocessingml/2006/main" xmlns:w14="http://schemas.microsoft.com/office/word/2010/wordml" xmlns:w15="http://schemas.microsoft.com/office/word/2012/wordml" xmlns:w16cex="http://schemas.microsoft.com/office/word/2018/wordml/cex" xmlns:w16cid="http://schemas.microsoft.com/office/word/2016/wordml/cid" xmlns:w16="http://schemas.microsoft.com/office/word/2018/wordml" xmlns:w16du="http://schemas.microsoft.com/office/word/2023/wordml/word16du" xmlns:w16sdtdh="http://schemas.microsoft.com/office/word/2020/wordml/sdtdatahash" xmlns:w16sdtfl="http://schemas.microsoft.com/office/word/2024/wordml/sdtformatlock" xmlns:w16se="http://schemas.microsoft.com/office/word/2015/wordml/symex" mc:Ignorable="w14 w15 w16se w16cid w16 w16cex w16sdtdh w16sdtfl w16du">
+<w:styles xmlns:mc="http://schemas.openxmlformats.org/markup-compatibility/2006" xmlns:r="http://schemas.openxmlformats.org/officeDocument/2006/relationships" xmlns:w="http://schemas.openxmlformats.org/wordprocessingml/2006/main" xmlns:w14="http://schemas.microsoft.com/office/word/2010/wordml" xmlns:w15="http://schemas.microsoft.com/office/word/2012/wordml" xmlns:w16cex="http://schemas.microsoft.com/office/word/2018/wordml/cex" xmlns:w16cid="http://schemas.microsoft.com/office/word/2016/wordml/cid" xmlns:w16="http://schemas.microsoft.com/office/word/2018/wordml" xmlns:w16sdtdh="http://schemas.microsoft.com/office/word/2020/wordml/sdtdatahash" xmlns:w16sdtfl="http://schemas.microsoft.com/office/word/2024/wordml/sdtformatlock" xmlns:w16se="http://schemas.microsoft.com/office/word/2015/wordml/symex" xmlns:w16du="http://schemas.microsoft.com/office/word/2023/wordml/word16du" mc:Ignorable="w14 w15 w16se w16cid w16 w16cex w16sdtdh w16sdtfl w16du">
   <w:docDefaults>
     <w:rPrDefault>
       <w:rPr>
@@ -2628,7 +2637,6 @@
 <ds:datastoreItem xmlns:ds="http://schemas.openxmlformats.org/officeDocument/2006/customXml" ds:itemID="{11111111-1234-1234-1234-123412341234}">
   <ds:schemaRefs>
     <ds:schemaRef ds:uri="http://customooxmlschemas.google.com/"/>
-    <ds:schemaRef ds:uri="http://www.w3.org/2000/xmlns/"/>
     <ds:schemaRef ds:uri="http://schemas.openxmlformats.org/officeDocument/2006/relationships"/>
   </ds:schemaRefs>
 </ds:datastoreItem>

</xml_diff>